<commit_message>
Replace course form documents
Co-authored-by: Copilot App <223556219+Copilot@users.noreply.github.com>
</commit_message>
<xml_diff>
--- a/resources/forms/Martens5E_HKPropel_Form 12.1.docx
+++ b/resources/forms/Martens5E_HKPropel_Form 12.1.docx
@@ -7,13 +7,8 @@
         <w:pStyle w:val="Heading1"/>
         <w:spacing w:before="0" w:line="24" w:lineRule="atLeast"/>
       </w:pPr>
-      <w:proofErr w:type="gramStart"/>
-      <w:r>
-        <w:t>Form</w:t>
-      </w:r>
-      <w:proofErr w:type="gramEnd"/>
-      <w:r>
-        <w:t xml:space="preserve"> 12.</w:t>
+      <w:r>
+        <w:t>Form 12.</w:t>
       </w:r>
       <w:r>
         <w:rPr>
@@ -352,7 +347,7 @@
         <w:sz w:val="20"/>
         <w:szCs w:val="20"/>
       </w:rPr>
-      <w:t xml:space="preserve">. (Human Kinetics, 2027). Reprinted by permission from R. Martens, </w:t>
+      <w:t xml:space="preserve"> (Human Kinetics, 2027). Reprinted by permission from R. Martens, </w:t>
     </w:r>
     <w:r>
       <w:rPr>

</xml_diff>